<commit_message>
Evidence report .docx: fix clipped figures and compress images
Figure columns now have fixed widths and captions start on their own
line; screenshots are embedded as JPEG (108 KB, was 214 KB). Same
content, still 2 pages.
</commit_message>
<xml_diff>
--- a/submission/ICS570-Lab2-Group1-Evidence-Report.docx
+++ b/submission/ICS570-Lab2-Group1-Evidence-Report.docx
@@ -2096,8 +2096,8 @@
         <w:jc w:val="start"/>
       </w:tblPr>
       <w:tblGrid>
-        <w:gridCol w:w="3960"/>
-        <w:gridCol w:w="3960"/>
+        <w:gridCol w:w="2772"/>
+        <w:gridCol w:w="5148"/>
       </w:tblGrid>
       <w:tr>
         <w:tc>
@@ -2119,7 +2119,7 @@
                     <a:graphicData uri="http://schemas.openxmlformats.org/drawingml/2006/picture">
                       <pic:pic>
                         <pic:nvPicPr>
-                          <pic:cNvPr descr="evidence/screenshots/report/fig1-T1-register.png" id="23" name="Picture"/>
+                          <pic:cNvPr descr="evidence/screenshots/report/fig1-T1-register.jpg" id="23" name="Picture"/>
                           <pic:cNvPicPr>
                             <a:picLocks noChangeArrowheads="1" noChangeAspect="1"/>
                           </pic:cNvPicPr>
@@ -2152,6 +2152,9 @@
               </w:drawing>
             </w:r>
             <w:r>
+              <w:br/>
+            </w:r>
+            <w:r>
               <w:rPr>
                 <w:bCs/>
                 <w:b/>
@@ -2176,14 +2179,14 @@
             <w:r>
               <w:drawing>
                 <wp:inline>
-                  <wp:extent cx="4102354" cy="492282"/>
+                  <wp:extent cx="3705352" cy="444642"/>
                   <wp:effectExtent b="0" l="0" r="0" t="0"/>
                   <wp:docPr descr="T6" title="" id="25" name="Picture"/>
                   <a:graphic>
                     <a:graphicData uri="http://schemas.openxmlformats.org/drawingml/2006/picture">
                       <pic:pic>
                         <pic:nvPicPr>
-                          <pic:cNvPr descr="evidence/screenshots/report/fig2-T6-direct-url.png" id="26" name="Picture"/>
+                          <pic:cNvPr descr="evidence/screenshots/report/fig2-T6-direct-url.jpg" id="26" name="Picture"/>
                           <pic:cNvPicPr>
                             <a:picLocks noChangeArrowheads="1" noChangeAspect="1"/>
                           </pic:cNvPicPr>
@@ -2197,7 +2200,7 @@
                         <pic:spPr bwMode="auto">
                           <a:xfrm>
                             <a:off x="0" y="0"/>
-                            <a:ext cx="4102354" cy="492282"/>
+                            <a:ext cx="3705352" cy="444642"/>
                           </a:xfrm>
                           <a:prstGeom prst="rect">
                             <a:avLst/>
@@ -2216,6 +2219,9 @@
               </w:drawing>
             </w:r>
             <w:r>
+              <w:br/>
+            </w:r>
+            <w:r>
               <w:rPr>
                 <w:bCs/>
                 <w:b/>
@@ -2266,14 +2272,14 @@
             <w:r>
               <w:drawing>
                 <wp:inline>
-                  <wp:extent cx="4102354" cy="1663116"/>
+                  <wp:extent cx="3705352" cy="1502351"/>
                   <wp:effectExtent b="0" l="0" r="0" t="0"/>
                   <wp:docPr descr="T8" title="" id="28" name="Picture"/>
                   <a:graphic>
                     <a:graphicData uri="http://schemas.openxmlformats.org/drawingml/2006/picture">
                       <pic:pic>
                         <pic:nvPicPr>
-                          <pic:cNvPr descr="evidence/screenshots/report/fig4-T8-roster.png" id="29" name="Picture"/>
+                          <pic:cNvPr descr="evidence/screenshots/report/fig4-T8-roster.jpg" id="29" name="Picture"/>
                           <pic:cNvPicPr>
                             <a:picLocks noChangeArrowheads="1" noChangeAspect="1"/>
                           </pic:cNvPicPr>
@@ -2287,7 +2293,7 @@
                         <pic:spPr bwMode="auto">
                           <a:xfrm>
                             <a:off x="0" y="0"/>
-                            <a:ext cx="4102354" cy="1663116"/>
+                            <a:ext cx="3705352" cy="1502351"/>
                           </a:xfrm>
                           <a:prstGeom prst="rect">
                             <a:avLst/>
@@ -2306,6 +2312,9 @@
               </w:drawing>
             </w:r>
             <w:r>
+              <w:br/>
+            </w:r>
+            <w:r>
               <w:rPr>
                 <w:bCs/>
                 <w:b/>
@@ -2329,13 +2338,13 @@
           <w:tbl>
             <w:tblPr>
               <w:tblStyle w:val="Table"/>
-              <w:tblW w:type="auto" w:w="0"/>
+              <w:tblW w:type="pct" w:w="5000"/>
               <w:tblLook w:firstRow="0" w:lastRow="0" w:firstColumn="0" w:lastColumn="0" w:noHBand="0" w:noVBand="0" w:val="0000"/>
               <w:jc w:val="start"/>
             </w:tblPr>
             <w:tblGrid>
-              <w:gridCol w:w="3960"/>
-              <w:gridCol w:w="3960"/>
+              <w:gridCol w:w="2455"/>
+              <w:gridCol w:w="5464"/>
             </w:tblGrid>
             <w:tr>
               <w:tc>
@@ -2356,7 +2365,7 @@
                           <a:graphicData uri="http://schemas.openxmlformats.org/drawingml/2006/picture">
                             <pic:pic>
                               <pic:nvPicPr>
-                                <pic:cNvPr descr="evidence/screenshots/report/fig3a-T3-card.png" id="32" name="Picture"/>
+                                <pic:cNvPr descr="evidence/screenshots/report/fig3a-T3-card.jpg" id="32" name="Picture"/>
                                 <pic:cNvPicPr>
                                   <a:picLocks noChangeArrowheads="1" noChangeAspect="1"/>
                                 </pic:cNvPicPr>
@@ -2401,14 +2410,14 @@
                   <w:r>
                     <w:drawing>
                       <wp:inline>
-                        <wp:extent cx="4499356" cy="1757560"/>
+                        <wp:extent cx="3837686" cy="1499096"/>
                         <wp:effectExtent b="0" l="0" r="0" t="0"/>
                         <wp:docPr descr="T7" title="" id="34" name="Picture"/>
                         <a:graphic>
                           <a:graphicData uri="http://schemas.openxmlformats.org/drawingml/2006/picture">
                             <pic:pic>
                               <pic:nvPicPr>
-                                <pic:cNvPr descr="evidence/screenshots/report/fig3b-T7-denied.png" id="35" name="Picture"/>
+                                <pic:cNvPr descr="evidence/screenshots/report/fig3b-T7-denied.jpg" id="35" name="Picture"/>
                                 <pic:cNvPicPr>
                                   <a:picLocks noChangeArrowheads="1" noChangeAspect="1"/>
                                 </pic:cNvPicPr>
@@ -2422,7 +2431,7 @@
                               <pic:spPr bwMode="auto">
                                 <a:xfrm>
                                   <a:off x="0" y="0"/>
-                                  <a:ext cx="4499356" cy="1757560"/>
+                                  <a:ext cx="3837686" cy="1499096"/>
                                 </a:xfrm>
                                 <a:prstGeom prst="rect">
                                   <a:avLst/>

</xml_diff>